<commit_message>
Alle Logos und Favicons auf echtes Markenzeichen vereinheitlichen
Quelle: 07 Anhänge/WirkVektor Logo.svg (W + Teal-Pfeil). Bisherige
Platzhalter (favicon "WV"-Kachel, generischer logo-wv-Schriftzug) ersetzt.

- _build/sync_logos.py leitet aus dem Master eine transparente Variante
  und ein Favicon (Marke auf weißer, abgerundeter Kachel) ab und verteilt
  beide an Website (public + src/assets), Anhänge-Kopien und erzeugt ein
  PNG für die Office-Vorlagen
- Vorlagen: gezeichnetes "WV"-Quadrat durch echtes Logo ersetzt
  (docx-Briefkopf, pptx-Cover/Divider/Danke) und neu generiert
- DESIGN.md: Logo-Abschnitt ergänzt, Favicon-Beschreibung korrigiert
- Grafik-README + Projektnotiz aktualisiert

https://claude.ai/code/session_013egZ2k5Rzfr4iL9x1fQw48
</commit_message>
<xml_diff>
--- a/02 Projekte/Geschäftsausstattung und Vorlagen/Vorlagen/Geschäftsausstattung/Angebot.docx
+++ b/02 Projekte/Geschäftsausstattung und Vorlagen/Vorlagen/Geschäftsausstattung/Angebot.docx
@@ -1458,6 +1458,43 @@
             <w:spacing w:after="0"/>
           </w:pPr>
           <w:r>
+            <w:drawing>
+              <wp:inline xmlns:a="http://schemas.openxmlformats.org/drawingml/2006/main" xmlns:pic="http://schemas.openxmlformats.org/drawingml/2006/picture">
+                <wp:extent cx="216000" cy="216000"/>
+                <wp:docPr id="1" name="Picture 1"/>
+                <wp:cNvGraphicFramePr>
+                  <a:graphicFrameLocks noChangeAspect="1"/>
+                </wp:cNvGraphicFramePr>
+                <a:graphic>
+                  <a:graphicData uri="http://schemas.openxmlformats.org/drawingml/2006/picture">
+                    <pic:pic>
+                      <pic:nvPicPr>
+                        <pic:cNvPr id="0" name="wv-logo.png"/>
+                        <pic:cNvPicPr/>
+                      </pic:nvPicPr>
+                      <pic:blipFill>
+                        <a:blip r:embed="rId1"/>
+                        <a:stretch>
+                          <a:fillRect/>
+                        </a:stretch>
+                      </pic:blipFill>
+                      <pic:spPr>
+                        <a:xfrm>
+                          <a:off x="0" y="0"/>
+                          <a:ext cx="216000" cy="216000"/>
+                        </a:xfrm>
+                        <a:prstGeom prst="rect"/>
+                      </pic:spPr>
+                    </pic:pic>
+                  </a:graphicData>
+                </a:graphic>
+              </wp:inline>
+            </w:drawing>
+          </w:r>
+          <w:r>
+            <w:t xml:space="preserve">  </w:t>
+          </w:r>
+          <w:r>
             <w:rPr>
               <w:rFonts w:ascii="Hanken Grotesk" w:hAnsi="Hanken Grotesk" w:cs="Hanken Grotesk"/>
               <w:b/>

</xml_diff>